<commit_message>
fix(cad): Modul 10 - alias Spreadsheet tidak memakai nama satuan (tebal, gaya, tinggi, Htot), beban praktik 1000 N dan batas defleksi 0,25 mm
Co-Authored-By: Claude Sonnet 5.5 <noreply@anthropic.com>
</commit_message>
<xml_diff>
--- a/Pemodelan-Computer-Aided-Design/Modul-Word/Modul-10-Optimasi-Desain-Pasca-Simulasi.docx
+++ b/Pemodelan-Computer-Aided-Design/Modul-Word/Modul-10-Optimasi-Desain-Pasca-Simulasi.docx
@@ -10633,7 +10633,7 @@
           <w:i w:val="0"/>
           <w:sz w:val="21"/>
         </w:rPr>
-        <w:t xml:space="preserve"> (Material Editor) mengisi ρ, E, dan ν sekaligus untuk bacaan massa dan untuk FEM; ganti material di satu tempat, lalu Analysis memakai nilai yang sama. Untuk substitusi aluminium, tinggi diikat ekspresi =Spreadsheet.h * pow(Spreadsheet.E_st / Spreadsheet.E_Al; 1/3) agar E·I tetap saat material berganti.</w:t>
+        <w:t xml:space="preserve"> (Material Editor) mengisi ρ, E, dan ν sekaligus untuk bacaan massa dan untuk FEM; ganti material di satu tempat, lalu Analysis memakai nilai yang sama. Untuk substitusi aluminium, tinggi diikat ekspresi =Spreadsheet.tinggi * pow(Spreadsheet.E_st / Spreadsheet.E_Al; 1/3) agar E·I tetap saat material berganti.</w:t>
       </w:r>
     </w:p>
     <w:p>
@@ -10872,7 +10872,7 @@
                 <w:i w:val="0"/>
                 <w:sz w:val="18"/>
               </w:rPr>
-              <w:t>F</w:t>
+              <w:t>gaya</w:t>
             </w:r>
           </w:p>
         </w:tc>
@@ -11222,7 +11222,7 @@
                 <w:i w:val="0"/>
                 <w:sz w:val="18"/>
               </w:rPr>
-              <w:t>=sqrt(6*F*L/(b*sigma_izin))</w:t>
+              <w:t>=sqrt(6*gaya*L/(b*sigma_izin))</w:t>
             </w:r>
           </w:p>
         </w:tc>
@@ -11281,7 +11281,7 @@
                 <w:i w:val="0"/>
                 <w:sz w:val="18"/>
               </w:rPr>
-              <w:t>h</w:t>
+              <w:t>tinggi</w:t>
             </w:r>
           </w:p>
         </w:tc>
@@ -11378,7 +11378,7 @@
                 <w:i w:val="0"/>
                 <w:sz w:val="18"/>
               </w:rPr>
-              <w:t>=4*F*L^3/(210000*b*h^3)</w:t>
+              <w:t>=4*gaya*L^3/(210000*b*tinggi^3)</w:t>
             </w:r>
           </w:p>
         </w:tc>
@@ -11456,7 +11456,7 @@
                 <w:i w:val="0"/>
                 <w:sz w:val="18"/>
               </w:rPr>
-              <w:t>=7.85e-3*L*b*h</w:t>
+              <w:t>=7.85e-3*L*b*tinggi</w:t>
             </w:r>
           </w:p>
         </w:tc>
@@ -11768,7 +11768,7 @@
           <w:i w:val="0"/>
           <w:sz w:val="21"/>
         </w:rPr>
-        <w:t xml:space="preserve"> empat slider berperan sebagai alias Spreadsheet B, H, t_f, t_w; profil I di kiri menghitung ulang I</w:t>
+        <w:t xml:space="preserve"> empat slider berperan sebagai alias Spreadsheet B, Htot, t_f, t_w; profil I di kiri menghitung ulang I</w:t>
       </w:r>
       <w:r>
         <w:rPr>
@@ -13554,7 +13554,7 @@
           <w:i w:val="0"/>
           <w:sz w:val="17"/>
         </w:rPr>
-        <w:t>for baris, (alias, nilai) in enumerate([("F", 800), ("L", 240), ("b", 20), ("sigma_izin", 125)], start=1):</w:t>
+        <w:t>for baris, (alias, nilai) in enumerate([("gaya", 800), ("L", 240), ("b", 20), ("sigma_izin", 125)], start=1):</w:t>
       </w:r>
       <w:r>
         <w:br/>
@@ -13578,7 +13578,7 @@
           <w:i w:val="0"/>
           <w:sz w:val="17"/>
         </w:rPr>
-        <w:t>sh.set("A5", "h_req"); sh.set("B5", "=sqrt(6*F*L/(b*sigma_izin))"); sh.setAlias("B5", "h_req")</w:t>
+        <w:t>sh.set("A5", "h_req"); sh.set("B5", "=sqrt(6*gaya*L/(b*sigma_izin))"); sh.setAlias("B5", "h_req")</w:t>
       </w:r>
       <w:r>
         <w:br/>
@@ -14368,7 +14368,7 @@
           <w:i w:val="0"/>
           <w:sz w:val="20"/>
         </w:rPr>
-        <w:t>Gambar 7 — Gambar kerja braket L iteratif: ukuran awal dan parameter yang diubah tiap langkah. Satuan mm; gaya dalam N dan tegangan dalam MPa. Kiri: profil L yang disketsa pada langkah 1 (braket 100 × 80, tebal t = 8) dengan fillet sudut dalam r = 2 yang dinaikkan menjadi 6 lalu 10 pada langkah 3 (busur merah muda), Fixed di muka kaki berlubang, dan F = 2000 N di tepi kaki tegak (langkah 2). Tengah: sketsa rusuk langkah 4 pada bidang tengah, kaki 40 × hr dengan hr = 20 lalu 30, Pad 5 simetris. Kanan: hasil Pad selebar 50 dengan lubang baut 2 × ⌀9 dan lubang ⌀d langkah 5 (15 → 20 → 25); langkah tidak menetapkan letak kedua jenis lubang itu, jadi posisinya tidak diberi ukuran. Nomor bulat di bawah merujuk nomor langkah.</w:t>
+        <w:t>Gambar 7 — Gambar kerja braket L iteratif: ukuran awal dan parameter yang diubah tiap langkah. Satuan mm; gaya dalam N dan tegangan dalam MPa. Kiri: profil L yang disketsa pada langkah 1 (braket 100 × 80, tebal t = 8) dengan fillet sudut dalam r = 2 yang dinaikkan menjadi 6 lalu 10 pada langkah 3 (busur merah muda), Fixed di muka kaki berlubang, dan F = 1000 N di tepi kaki tegak (langkah 2). Tengah: sketsa rusuk langkah 4 pada bidang tengah, kaki 40 × hr dengan hr = 20 lalu 30, Pad 5 simetris. Kanan: hasil Pad selebar 50 dengan lubang baut 2 × ⌀9 dan lubang ⌀d langkah 5 (15 → 20 → 25); langkah tidak menetapkan letak kedua jenis lubang itu, jadi posisinya tidak diberi ukuran. Nomor bulat di bawah merujuk nomor langkah.</w:t>
       </w:r>
     </w:p>
     <w:p>
@@ -14401,7 +14401,7 @@
           <w:i w:val="0"/>
           <w:sz w:val="22"/>
         </w:rPr>
-        <w:t>Spreadsheet: alias t = 8, r = 2, hr = 0, d = 0, F = 2000. Body: braket L 100 × 80 (lebar 50) dengan Sketch tebal =Spreadsheet.t, lubang baut 2 × ⌀9 di kaki, fillet sudut dalam radius =Spreadsheet.r. Recompute, catat massa baja (Volume × 7,85×10⁻³).</w:t>
+        <w:t>Spreadsheet: alias tebal = 8, r = 2, hr = 0, d = 0, gaya = 1000 (jangan memakai t atau F: FreeCAD menolaknya sebagai alias karena sama dengan satuan ton dan farad). Body: braket L 100 × 80 (lebar 50) dengan Sketch tebal =Spreadsheet.tebal, lubang baut 2 × ⌀9 di kaki, fillet sudut dalam radius =Spreadsheet.r. Recompute, catat massa baja (Volume × 7,85×10⁻³).</w:t>
       </w:r>
     </w:p>
     <w:p>
@@ -14434,7 +14434,7 @@
           <w:i w:val="0"/>
           <w:sz w:val="22"/>
         </w:rPr>
-        <w:t>FEM Workbench (Modul 8): Analysis, material Steel, mesh Gmsh 3 mm, Fixed di muka kaki berlubang, Force F pada tepi kaki tegak, solve CalculiX. Catat σ</w:t>
+        <w:t>FEM Workbench (Modul 8): Analysis, material Steel, mesh Gmsh 3 mm, Fixed di muka kaki berlubang, Force =Spreadsheet.gaya pada tepi kaki tegak, solve CalculiX. Catat σ</w:t>
       </w:r>
       <w:r>
         <w:rPr>
@@ -14562,7 +14562,26 @@
           <w:i w:val="0"/>
           <w:sz w:val="22"/>
         </w:rPr>
-        <w:t xml:space="preserve"> ≥ 2.</w:t>
+        <w:t xml:space="preserve"> ≥ 2 (pada gaya = 1000 N dan tebal = 8 mm, r = 10 memberi σ</w:t>
+      </w:r>
+      <w:r>
+        <w:rPr>
+          <w:rFonts w:ascii="Arial" w:hAnsi="Arial" w:eastAsia="Arial" w:cs="Arial"/>
+          <w:b w:val="0"/>
+          <w:i w:val="0"/>
+          <w:sz w:val="22"/>
+          <w:vertAlign w:val="subscript"/>
+        </w:rPr>
+        <w:t>maks</w:t>
+      </w:r>
+      <w:r>
+        <w:rPr>
+          <w:rFonts w:ascii="Arial" w:hAnsi="Arial" w:eastAsia="Arial" w:cs="Arial"/>
+          <w:b w:val="0"/>
+          <w:i w:val="0"/>
+          <w:sz w:val="22"/>
+        </w:rPr>
+        <w:t xml:space="preserve"> ≈ 125 MPa; bila SF masih &lt; 2, perbesar r atau tebal).</w:t>
       </w:r>
     </w:p>
     <w:p>
@@ -14614,7 +14633,7 @@
           <w:i w:val="0"/>
           <w:sz w:val="22"/>
         </w:rPr>
-        <w:t xml:space="preserve"> &gt; 0,4 mm: sketsa segitiga rusuk pada bidang tengah (kaki 40 × hr), Pad 5 mm simetris; ubah hr = 20 → 30. Catat δ turun (Bagian 03) dan σ baru di pertemuan rusuk–pelat; beri fillet 2 mm di sana.</w:t>
+        <w:t xml:space="preserve"> &gt; 0,25 mm: sketsa segitiga rusuk pada bidang tengah (kaki 40 × hr), Pad 5 mm simetris; ubah hr = 20 → 30. Catat δ turun (Bagian 03) dan σ baru di pertemuan rusuk–pelat; beri fillet 2 mm di sana.</w:t>
       </w:r>
     </w:p>
     <w:p>
@@ -14699,7 +14718,7 @@
           <w:i w:val="0"/>
           <w:sz w:val="22"/>
         </w:rPr>
-        <w:t>Duplikat dokumen; material Aluminium, tebal =Spreadsheet.t * pow(3; 1/3). Solve: δ hampir sama, massa ≈ setengah, periksa σ</w:t>
+        <w:t>Duplikat dokumen; material Aluminium, tebal =Spreadsheet.tebal * pow(3; 1/3). Solve: δ hampir sama, massa ≈ setengah, periksa σ</w:t>
       </w:r>
       <w:r>
         <w:rPr>
@@ -14751,7 +14770,7 @@
           <w:i w:val="0"/>
           <w:sz w:val="22"/>
         </w:rPr>
-        <w:t>Lengkapi tabel iterasi (r, hr, d, material, σ, δ, massa, SF); pilih desain dengan SF ≥ 2, δ ≤ 0,4 mm, massa terkecil. Ctrl+S → Latihan10_NIM.FCStd.</w:t>
+        <w:t>Lengkapi tabel iterasi (r, hr, d, material, σ, δ, massa, SF); pilih desain dengan SF ≥ 2, δ ≤ 0,25 mm, massa terkecil; bila belum ada kombinasi yang memenuhi keduanya, catat kombinasi terbaik dan usulkan perbaikan (mis. fillet pertemuan rusuk, tebal lebih besar). Ctrl+S → Latihan10_NIM.FCStd.</w:t>
       </w:r>
     </w:p>
     <w:p>
@@ -14919,7 +14938,7 @@
                 <w:i w:val="0"/>
                 <w:sz w:val="18"/>
               </w:rPr>
-              <w:t>Model tidak berubah setelah sel diedit</w:t>
+              <w:t>“Invalid alias” padahal nama sudah benar (mis. t, F, h, H)</w:t>
             </w:r>
           </w:p>
         </w:tc>
@@ -14938,7 +14957,7 @@
                 <w:i w:val="0"/>
                 <w:sz w:val="18"/>
               </w:rPr>
-              <w:t>Belum recompute</w:t>
+              <w:t>Alias sama dengan nama satuan FreeCAD: t = ton, F = farad, h = jam, H = henry (juga T, W, N, M, K, m, l, A, V, S, G, g, e, s)</w:t>
             </w:r>
           </w:p>
         </w:tc>
@@ -14957,7 +14976,7 @@
                 <w:i w:val="0"/>
                 <w:sz w:val="18"/>
               </w:rPr>
-              <w:t>Ctrl+R (Std Refresh); pastikan ikon fitur tidak biru-tanda</w:t>
+              <w:t>Pakai nama lebih panjang: tebal, gaya, tinggi, Htot; lalu tulis ekspresi dengan nama itu</w:t>
             </w:r>
           </w:p>
         </w:tc>
@@ -14978,6 +14997,65 @@
                 <w:i w:val="0"/>
                 <w:sz w:val="18"/>
               </w:rPr>
+              <w:t>Model tidak berubah setelah sel diedit</w:t>
+            </w:r>
+          </w:p>
+        </w:tc>
+        <w:tc>
+          <w:tcPr>
+            <w:tcW w:type="dxa" w:w="2929"/>
+          </w:tcPr>
+          <w:p>
+            <w:pPr>
+              <w:spacing w:after="0"/>
+            </w:pPr>
+            <w:r>
+              <w:rPr>
+                <w:rFonts w:ascii="Arial" w:hAnsi="Arial" w:eastAsia="Arial" w:cs="Arial"/>
+                <w:b w:val="0"/>
+                <w:i w:val="0"/>
+                <w:sz w:val="18"/>
+              </w:rPr>
+              <w:t>Belum recompute</w:t>
+            </w:r>
+          </w:p>
+        </w:tc>
+        <w:tc>
+          <w:tcPr>
+            <w:tcW w:type="dxa" w:w="2929"/>
+          </w:tcPr>
+          <w:p>
+            <w:pPr>
+              <w:spacing w:after="0"/>
+            </w:pPr>
+            <w:r>
+              <w:rPr>
+                <w:rFonts w:ascii="Arial" w:hAnsi="Arial" w:eastAsia="Arial" w:cs="Arial"/>
+                <w:b w:val="0"/>
+                <w:i w:val="0"/>
+                <w:sz w:val="18"/>
+              </w:rPr>
+              <w:t>Ctrl+R (Std Refresh); pastikan ikon fitur tidak biru-tanda</w:t>
+            </w:r>
+          </w:p>
+        </w:tc>
+      </w:tr>
+      <w:tr>
+        <w:tc>
+          <w:tcPr>
+            <w:tcW w:type="dxa" w:w="2929"/>
+          </w:tcPr>
+          <w:p>
+            <w:pPr>
+              <w:spacing w:after="0"/>
+            </w:pPr>
+            <w:r>
+              <w:rPr>
+                <w:rFonts w:ascii="Arial" w:hAnsi="Arial" w:eastAsia="Arial" w:cs="Arial"/>
+                <w:b w:val="0"/>
+                <w:i w:val="0"/>
+                <w:sz w:val="18"/>
+              </w:rPr>
               <w:t>Fillet gagal setelah r diperbesar</w:t>
             </w:r>
           </w:p>
@@ -15016,7 +15094,7 @@
                 <w:i w:val="0"/>
                 <w:sz w:val="18"/>
               </w:rPr>
-              <w:t>Batasi r di Spreadsheet: =min(r; t/2 − 0.5)</w:t>
+              <w:t>Batasi r di Spreadsheet: =min(r; tebal/2 − 0.5)</w:t>
             </w:r>
           </w:p>
         </w:tc>
@@ -16618,7 +16696,7 @@
           <w:i w:val="0"/>
           <w:sz w:val="21"/>
         </w:rPr>
-        <w:t>(C) Memberi nama sel (mis. F, L, h_req) agar dapat dirujuk ekspresi di properti fitur atau konstrain sketsa, seperti =Spreadsheet.h_req</w:t>
+        <w:t>(C) Memberi nama sel (mis. gaya, L, h_req) agar dapat dirujuk ekspresi di properti fitur atau konstrain sketsa, seperti =Spreadsheet.h_req</w:t>
       </w:r>
     </w:p>
     <w:p>

</xml_diff>

<commit_message>
fix(cad): Modul 10 - alias Spreadsheet tidak memakai nama satuan (tebal, gaya, tinggi, Htot), beban praktik 1000 N dan batas defleksi 0,25 mm (#1025)
Co-authored-by: Claude Sonnet 5.5 <noreply@anthropic.com>
</commit_message>
<xml_diff>
--- a/Pemodelan-Computer-Aided-Design/Modul-Word/Modul-10-Optimasi-Desain-Pasca-Simulasi.docx
+++ b/Pemodelan-Computer-Aided-Design/Modul-Word/Modul-10-Optimasi-Desain-Pasca-Simulasi.docx
@@ -10633,7 +10633,7 @@
           <w:i w:val="0"/>
           <w:sz w:val="21"/>
         </w:rPr>
-        <w:t xml:space="preserve"> (Material Editor) mengisi ρ, E, dan ν sekaligus untuk bacaan massa dan untuk FEM; ganti material di satu tempat, lalu Analysis memakai nilai yang sama. Untuk substitusi aluminium, tinggi diikat ekspresi =Spreadsheet.h * pow(Spreadsheet.E_st / Spreadsheet.E_Al; 1/3) agar E·I tetap saat material berganti.</w:t>
+        <w:t xml:space="preserve"> (Material Editor) mengisi ρ, E, dan ν sekaligus untuk bacaan massa dan untuk FEM; ganti material di satu tempat, lalu Analysis memakai nilai yang sama. Untuk substitusi aluminium, tinggi diikat ekspresi =Spreadsheet.tinggi * pow(Spreadsheet.E_st / Spreadsheet.E_Al; 1/3) agar E·I tetap saat material berganti.</w:t>
       </w:r>
     </w:p>
     <w:p>
@@ -10872,7 +10872,7 @@
                 <w:i w:val="0"/>
                 <w:sz w:val="18"/>
               </w:rPr>
-              <w:t>F</w:t>
+              <w:t>gaya</w:t>
             </w:r>
           </w:p>
         </w:tc>
@@ -11222,7 +11222,7 @@
                 <w:i w:val="0"/>
                 <w:sz w:val="18"/>
               </w:rPr>
-              <w:t>=sqrt(6*F*L/(b*sigma_izin))</w:t>
+              <w:t>=sqrt(6*gaya*L/(b*sigma_izin))</w:t>
             </w:r>
           </w:p>
         </w:tc>
@@ -11281,7 +11281,7 @@
                 <w:i w:val="0"/>
                 <w:sz w:val="18"/>
               </w:rPr>
-              <w:t>h</w:t>
+              <w:t>tinggi</w:t>
             </w:r>
           </w:p>
         </w:tc>
@@ -11378,7 +11378,7 @@
                 <w:i w:val="0"/>
                 <w:sz w:val="18"/>
               </w:rPr>
-              <w:t>=4*F*L^3/(210000*b*h^3)</w:t>
+              <w:t>=4*gaya*L^3/(210000*b*tinggi^3)</w:t>
             </w:r>
           </w:p>
         </w:tc>
@@ -11456,7 +11456,7 @@
                 <w:i w:val="0"/>
                 <w:sz w:val="18"/>
               </w:rPr>
-              <w:t>=7.85e-3*L*b*h</w:t>
+              <w:t>=7.85e-3*L*b*tinggi</w:t>
             </w:r>
           </w:p>
         </w:tc>
@@ -11768,7 +11768,7 @@
           <w:i w:val="0"/>
           <w:sz w:val="21"/>
         </w:rPr>
-        <w:t xml:space="preserve"> empat slider berperan sebagai alias Spreadsheet B, H, t_f, t_w; profil I di kiri menghitung ulang I</w:t>
+        <w:t xml:space="preserve"> empat slider berperan sebagai alias Spreadsheet B, Htot, t_f, t_w; profil I di kiri menghitung ulang I</w:t>
       </w:r>
       <w:r>
         <w:rPr>
@@ -13554,7 +13554,7 @@
           <w:i w:val="0"/>
           <w:sz w:val="17"/>
         </w:rPr>
-        <w:t>for baris, (alias, nilai) in enumerate([("F", 800), ("L", 240), ("b", 20), ("sigma_izin", 125)], start=1):</w:t>
+        <w:t>for baris, (alias, nilai) in enumerate([("gaya", 800), ("L", 240), ("b", 20), ("sigma_izin", 125)], start=1):</w:t>
       </w:r>
       <w:r>
         <w:br/>
@@ -13578,7 +13578,7 @@
           <w:i w:val="0"/>
           <w:sz w:val="17"/>
         </w:rPr>
-        <w:t>sh.set("A5", "h_req"); sh.set("B5", "=sqrt(6*F*L/(b*sigma_izin))"); sh.setAlias("B5", "h_req")</w:t>
+        <w:t>sh.set("A5", "h_req"); sh.set("B5", "=sqrt(6*gaya*L/(b*sigma_izin))"); sh.setAlias("B5", "h_req")</w:t>
       </w:r>
       <w:r>
         <w:br/>
@@ -14368,7 +14368,7 @@
           <w:i w:val="0"/>
           <w:sz w:val="20"/>
         </w:rPr>
-        <w:t>Gambar 7 — Gambar kerja braket L iteratif: ukuran awal dan parameter yang diubah tiap langkah. Satuan mm; gaya dalam N dan tegangan dalam MPa. Kiri: profil L yang disketsa pada langkah 1 (braket 100 × 80, tebal t = 8) dengan fillet sudut dalam r = 2 yang dinaikkan menjadi 6 lalu 10 pada langkah 3 (busur merah muda), Fixed di muka kaki berlubang, dan F = 2000 N di tepi kaki tegak (langkah 2). Tengah: sketsa rusuk langkah 4 pada bidang tengah, kaki 40 × hr dengan hr = 20 lalu 30, Pad 5 simetris. Kanan: hasil Pad selebar 50 dengan lubang baut 2 × ⌀9 dan lubang ⌀d langkah 5 (15 → 20 → 25); langkah tidak menetapkan letak kedua jenis lubang itu, jadi posisinya tidak diberi ukuran. Nomor bulat di bawah merujuk nomor langkah.</w:t>
+        <w:t>Gambar 7 — Gambar kerja braket L iteratif: ukuran awal dan parameter yang diubah tiap langkah. Satuan mm; gaya dalam N dan tegangan dalam MPa. Kiri: profil L yang disketsa pada langkah 1 (braket 100 × 80, tebal t = 8) dengan fillet sudut dalam r = 2 yang dinaikkan menjadi 6 lalu 10 pada langkah 3 (busur merah muda), Fixed di muka kaki berlubang, dan F = 1000 N di tepi kaki tegak (langkah 2). Tengah: sketsa rusuk langkah 4 pada bidang tengah, kaki 40 × hr dengan hr = 20 lalu 30, Pad 5 simetris. Kanan: hasil Pad selebar 50 dengan lubang baut 2 × ⌀9 dan lubang ⌀d langkah 5 (15 → 20 → 25); langkah tidak menetapkan letak kedua jenis lubang itu, jadi posisinya tidak diberi ukuran. Nomor bulat di bawah merujuk nomor langkah.</w:t>
       </w:r>
     </w:p>
     <w:p>
@@ -14401,7 +14401,7 @@
           <w:i w:val="0"/>
           <w:sz w:val="22"/>
         </w:rPr>
-        <w:t>Spreadsheet: alias t = 8, r = 2, hr = 0, d = 0, F = 2000. Body: braket L 100 × 80 (lebar 50) dengan Sketch tebal =Spreadsheet.t, lubang baut 2 × ⌀9 di kaki, fillet sudut dalam radius =Spreadsheet.r. Recompute, catat massa baja (Volume × 7,85×10⁻³).</w:t>
+        <w:t>Spreadsheet: alias tebal = 8, r = 2, hr = 0, d = 0, gaya = 1000 (jangan memakai t atau F: FreeCAD menolaknya sebagai alias karena sama dengan satuan ton dan farad). Body: braket L 100 × 80 (lebar 50) dengan Sketch tebal =Spreadsheet.tebal, lubang baut 2 × ⌀9 di kaki, fillet sudut dalam radius =Spreadsheet.r. Recompute, catat massa baja (Volume × 7,85×10⁻³).</w:t>
       </w:r>
     </w:p>
     <w:p>
@@ -14434,7 +14434,7 @@
           <w:i w:val="0"/>
           <w:sz w:val="22"/>
         </w:rPr>
-        <w:t>FEM Workbench (Modul 8): Analysis, material Steel, mesh Gmsh 3 mm, Fixed di muka kaki berlubang, Force F pada tepi kaki tegak, solve CalculiX. Catat σ</w:t>
+        <w:t>FEM Workbench (Modul 8): Analysis, material Steel, mesh Gmsh 3 mm, Fixed di muka kaki berlubang, Force =Spreadsheet.gaya pada tepi kaki tegak, solve CalculiX. Catat σ</w:t>
       </w:r>
       <w:r>
         <w:rPr>
@@ -14562,7 +14562,26 @@
           <w:i w:val="0"/>
           <w:sz w:val="22"/>
         </w:rPr>
-        <w:t xml:space="preserve"> ≥ 2.</w:t>
+        <w:t xml:space="preserve"> ≥ 2 (pada gaya = 1000 N dan tebal = 8 mm, r = 10 memberi σ</w:t>
+      </w:r>
+      <w:r>
+        <w:rPr>
+          <w:rFonts w:ascii="Arial" w:hAnsi="Arial" w:eastAsia="Arial" w:cs="Arial"/>
+          <w:b w:val="0"/>
+          <w:i w:val="0"/>
+          <w:sz w:val="22"/>
+          <w:vertAlign w:val="subscript"/>
+        </w:rPr>
+        <w:t>maks</w:t>
+      </w:r>
+      <w:r>
+        <w:rPr>
+          <w:rFonts w:ascii="Arial" w:hAnsi="Arial" w:eastAsia="Arial" w:cs="Arial"/>
+          <w:b w:val="0"/>
+          <w:i w:val="0"/>
+          <w:sz w:val="22"/>
+        </w:rPr>
+        <w:t xml:space="preserve"> ≈ 125 MPa; bila SF masih &lt; 2, perbesar r atau tebal).</w:t>
       </w:r>
     </w:p>
     <w:p>
@@ -14614,7 +14633,7 @@
           <w:i w:val="0"/>
           <w:sz w:val="22"/>
         </w:rPr>
-        <w:t xml:space="preserve"> &gt; 0,4 mm: sketsa segitiga rusuk pada bidang tengah (kaki 40 × hr), Pad 5 mm simetris; ubah hr = 20 → 30. Catat δ turun (Bagian 03) dan σ baru di pertemuan rusuk–pelat; beri fillet 2 mm di sana.</w:t>
+        <w:t xml:space="preserve"> &gt; 0,25 mm: sketsa segitiga rusuk pada bidang tengah (kaki 40 × hr), Pad 5 mm simetris; ubah hr = 20 → 30. Catat δ turun (Bagian 03) dan σ baru di pertemuan rusuk–pelat; beri fillet 2 mm di sana.</w:t>
       </w:r>
     </w:p>
     <w:p>
@@ -14699,7 +14718,7 @@
           <w:i w:val="0"/>
           <w:sz w:val="22"/>
         </w:rPr>
-        <w:t>Duplikat dokumen; material Aluminium, tebal =Spreadsheet.t * pow(3; 1/3). Solve: δ hampir sama, massa ≈ setengah, periksa σ</w:t>
+        <w:t>Duplikat dokumen; material Aluminium, tebal =Spreadsheet.tebal * pow(3; 1/3). Solve: δ hampir sama, massa ≈ setengah, periksa σ</w:t>
       </w:r>
       <w:r>
         <w:rPr>
@@ -14751,7 +14770,7 @@
           <w:i w:val="0"/>
           <w:sz w:val="22"/>
         </w:rPr>
-        <w:t>Lengkapi tabel iterasi (r, hr, d, material, σ, δ, massa, SF); pilih desain dengan SF ≥ 2, δ ≤ 0,4 mm, massa terkecil. Ctrl+S → Latihan10_NIM.FCStd.</w:t>
+        <w:t>Lengkapi tabel iterasi (r, hr, d, material, σ, δ, massa, SF); pilih desain dengan SF ≥ 2, δ ≤ 0,25 mm, massa terkecil; bila belum ada kombinasi yang memenuhi keduanya, catat kombinasi terbaik dan usulkan perbaikan (mis. fillet pertemuan rusuk, tebal lebih besar). Ctrl+S → Latihan10_NIM.FCStd.</w:t>
       </w:r>
     </w:p>
     <w:p>
@@ -14919,7 +14938,7 @@
                 <w:i w:val="0"/>
                 <w:sz w:val="18"/>
               </w:rPr>
-              <w:t>Model tidak berubah setelah sel diedit</w:t>
+              <w:t>“Invalid alias” padahal nama sudah benar (mis. t, F, h, H)</w:t>
             </w:r>
           </w:p>
         </w:tc>
@@ -14938,7 +14957,7 @@
                 <w:i w:val="0"/>
                 <w:sz w:val="18"/>
               </w:rPr>
-              <w:t>Belum recompute</w:t>
+              <w:t>Alias sama dengan nama satuan FreeCAD: t = ton, F = farad, h = jam, H = henry (juga T, W, N, M, K, m, l, A, V, S, G, g, e, s)</w:t>
             </w:r>
           </w:p>
         </w:tc>
@@ -14957,7 +14976,7 @@
                 <w:i w:val="0"/>
                 <w:sz w:val="18"/>
               </w:rPr>
-              <w:t>Ctrl+R (Std Refresh); pastikan ikon fitur tidak biru-tanda</w:t>
+              <w:t>Pakai nama lebih panjang: tebal, gaya, tinggi, Htot; lalu tulis ekspresi dengan nama itu</w:t>
             </w:r>
           </w:p>
         </w:tc>
@@ -14978,6 +14997,65 @@
                 <w:i w:val="0"/>
                 <w:sz w:val="18"/>
               </w:rPr>
+              <w:t>Model tidak berubah setelah sel diedit</w:t>
+            </w:r>
+          </w:p>
+        </w:tc>
+        <w:tc>
+          <w:tcPr>
+            <w:tcW w:type="dxa" w:w="2929"/>
+          </w:tcPr>
+          <w:p>
+            <w:pPr>
+              <w:spacing w:after="0"/>
+            </w:pPr>
+            <w:r>
+              <w:rPr>
+                <w:rFonts w:ascii="Arial" w:hAnsi="Arial" w:eastAsia="Arial" w:cs="Arial"/>
+                <w:b w:val="0"/>
+                <w:i w:val="0"/>
+                <w:sz w:val="18"/>
+              </w:rPr>
+              <w:t>Belum recompute</w:t>
+            </w:r>
+          </w:p>
+        </w:tc>
+        <w:tc>
+          <w:tcPr>
+            <w:tcW w:type="dxa" w:w="2929"/>
+          </w:tcPr>
+          <w:p>
+            <w:pPr>
+              <w:spacing w:after="0"/>
+            </w:pPr>
+            <w:r>
+              <w:rPr>
+                <w:rFonts w:ascii="Arial" w:hAnsi="Arial" w:eastAsia="Arial" w:cs="Arial"/>
+                <w:b w:val="0"/>
+                <w:i w:val="0"/>
+                <w:sz w:val="18"/>
+              </w:rPr>
+              <w:t>Ctrl+R (Std Refresh); pastikan ikon fitur tidak biru-tanda</w:t>
+            </w:r>
+          </w:p>
+        </w:tc>
+      </w:tr>
+      <w:tr>
+        <w:tc>
+          <w:tcPr>
+            <w:tcW w:type="dxa" w:w="2929"/>
+          </w:tcPr>
+          <w:p>
+            <w:pPr>
+              <w:spacing w:after="0"/>
+            </w:pPr>
+            <w:r>
+              <w:rPr>
+                <w:rFonts w:ascii="Arial" w:hAnsi="Arial" w:eastAsia="Arial" w:cs="Arial"/>
+                <w:b w:val="0"/>
+                <w:i w:val="0"/>
+                <w:sz w:val="18"/>
+              </w:rPr>
               <w:t>Fillet gagal setelah r diperbesar</w:t>
             </w:r>
           </w:p>
@@ -15016,7 +15094,7 @@
                 <w:i w:val="0"/>
                 <w:sz w:val="18"/>
               </w:rPr>
-              <w:t>Batasi r di Spreadsheet: =min(r; t/2 − 0.5)</w:t>
+              <w:t>Batasi r di Spreadsheet: =min(r; tebal/2 − 0.5)</w:t>
             </w:r>
           </w:p>
         </w:tc>
@@ -16618,7 +16696,7 @@
           <w:i w:val="0"/>
           <w:sz w:val="21"/>
         </w:rPr>
-        <w:t>(C) Memberi nama sel (mis. F, L, h_req) agar dapat dirujuk ekspresi di properti fitur atau konstrain sketsa, seperti =Spreadsheet.h_req</w:t>
+        <w:t>(C) Memberi nama sel (mis. gaya, L, h_req) agar dapat dirujuk ekspresi di properti fitur atau konstrain sketsa, seperti =Spreadsheet.h_req</w:t>
       </w:r>
     </w:p>
     <w:p>

</xml_diff>

<commit_message>
fix(cad): Modul 10 - gaya 900 N, batas delta 0,20 mm, fillet rusuk 5 mm dan uji konvergensi mesh
Co-Authored-By: Claude Sonnet 5.5 <noreply@anthropic.com>
</commit_message>
<xml_diff>
--- a/Pemodelan-Computer-Aided-Design/Modul-Word/Modul-10-Optimasi-Desain-Pasca-Simulasi.docx
+++ b/Pemodelan-Computer-Aided-Design/Modul-Word/Modul-10-Optimasi-Desain-Pasca-Simulasi.docx
@@ -14368,7 +14368,7 @@
           <w:i w:val="0"/>
           <w:sz w:val="20"/>
         </w:rPr>
-        <w:t>Gambar 7 — Gambar kerja braket L iteratif: ukuran awal dan parameter yang diubah tiap langkah. Satuan mm; gaya dalam N dan tegangan dalam MPa. Kiri: profil L yang disketsa pada langkah 1 (braket 100 × 80, tebal t = 8) dengan fillet sudut dalam r = 2 yang dinaikkan menjadi 6 lalu 10 pada langkah 3 (busur merah muda), Fixed di muka kaki berlubang, dan F = 1000 N di tepi kaki tegak (langkah 2). Tengah: sketsa rusuk langkah 4 pada bidang tengah, kaki 40 × hr dengan hr = 20 lalu 30, Pad 5 simetris. Kanan: hasil Pad selebar 50 dengan lubang baut 2 × ⌀9 dan lubang ⌀d langkah 5 (15 → 20 → 25); langkah tidak menetapkan letak kedua jenis lubang itu, jadi posisinya tidak diberi ukuran. Nomor bulat di bawah merujuk nomor langkah.</w:t>
+        <w:t>Gambar 7 — Gambar kerja braket L iteratif: ukuran awal dan parameter yang diubah tiap langkah. Satuan mm; gaya dalam N dan tegangan dalam MPa. Kiri: profil L yang disketsa pada langkah 1 (braket 100 × 80, tebal t = 8) dengan fillet sudut dalam r = 2 yang dinaikkan menjadi 6 lalu 10 pada langkah 3 (busur merah muda), Fixed di muka kaki berlubang, dan F = 900 N di tepi kaki tegak (langkah 2). Tengah: sketsa rusuk langkah 4 pada bidang tengah, kaki 40 × hr dengan hr = 20 lalu 30, Pad 5 simetris. Kanan: hasil Pad selebar 50 dengan lubang baut 2 × ⌀9 dan lubang ⌀d langkah 5 (15 → 20 → 25); langkah tidak menetapkan letak kedua jenis lubang itu, jadi posisinya tidak diberi ukuran. Nomor bulat di bawah merujuk nomor langkah.</w:t>
       </w:r>
     </w:p>
     <w:p>
@@ -14401,7 +14401,7 @@
           <w:i w:val="0"/>
           <w:sz w:val="22"/>
         </w:rPr>
-        <w:t>Spreadsheet: alias tebal = 8, r = 2, hr = 0, d = 0, gaya = 1000 (jangan memakai t atau F: FreeCAD menolaknya sebagai alias karena sama dengan satuan ton dan farad). Body: braket L 100 × 80 (lebar 50) dengan Sketch tebal =Spreadsheet.tebal, lubang baut 2 × ⌀9 di kaki, fillet sudut dalam radius =Spreadsheet.r. Recompute, catat massa baja (Volume × 7,85×10⁻³).</w:t>
+        <w:t>Spreadsheet: alias tebal = 8, r = 2, hr = 0, d = 0, gaya = 900 (jangan memakai t atau F: FreeCAD menolaknya sebagai alias karena sama dengan satuan ton dan farad). Body: braket L 100 × 80 (lebar 50) dengan Sketch tebal =Spreadsheet.tebal, lubang baut 2 × ⌀9 di kaki, fillet sudut dalam radius =Spreadsheet.r. Recompute, catat massa baja (Volume × 7,85×10⁻³).</w:t>
       </w:r>
     </w:p>
     <w:p>
@@ -14562,7 +14562,7 @@
           <w:i w:val="0"/>
           <w:sz w:val="22"/>
         </w:rPr>
-        <w:t xml:space="preserve"> ≥ 2 (pada gaya = 1000 N dan tebal = 8 mm, r = 10 memberi σ</w:t>
+        <w:t xml:space="preserve"> ≥ 2 (pada gaya = 900 N dan tebal = 8 mm, r = 10 memberi σ</w:t>
       </w:r>
       <w:r>
         <w:rPr>
@@ -14581,7 +14581,7 @@
           <w:i w:val="0"/>
           <w:sz w:val="22"/>
         </w:rPr>
-        <w:t xml:space="preserve"> ≈ 125 MPa; bila SF masih &lt; 2, perbesar r atau tebal).</w:t>
+        <w:t xml:space="preserve"> ≈ 113 MPa dan SF ≈ 2,2, sedangkan r = 6 baru SF ≈ 1,9; bila SF masih &lt; 2, perbesar r atau tebal).</w:t>
       </w:r>
     </w:p>
     <w:p>
@@ -14633,7 +14633,26 @@
           <w:i w:val="0"/>
           <w:sz w:val="22"/>
         </w:rPr>
-        <w:t xml:space="preserve"> &gt; 0,25 mm: sketsa segitiga rusuk pada bidang tengah (kaki 40 × hr), Pad 5 mm simetris; ubah hr = 20 → 30. Catat δ turun (Bagian 03) dan σ baru di pertemuan rusuk–pelat; beri fillet 2 mm di sana.</w:t>
+        <w:t xml:space="preserve"> &gt; 0,20 mm: sketsa segitiga rusuk pada bidang tengah (kaki 40 × hr), Pad 5 mm simetris; ubah hr = 20 → 30. Catat δ turun (Bagian 03). Di pertemuan rusuk–pelat tegangan naik lagi; beri fillet 5 mm di sana, lalu haluskan mesh dua kali (mis. 4 → 3 → 2,4 mm) dan catat σ</w:t>
+      </w:r>
+      <w:r>
+        <w:rPr>
+          <w:rFonts w:ascii="Arial" w:hAnsi="Arial" w:eastAsia="Arial" w:cs="Arial"/>
+          <w:b w:val="0"/>
+          <w:i w:val="0"/>
+          <w:sz w:val="22"/>
+          <w:vertAlign w:val="subscript"/>
+        </w:rPr>
+        <w:t>maks</w:t>
+      </w:r>
+      <w:r>
+        <w:rPr>
+          <w:rFonts w:ascii="Arial" w:hAnsi="Arial" w:eastAsia="Arial" w:cs="Arial"/>
+          <w:b w:val="0"/>
+          <w:i w:val="0"/>
+          <w:sz w:val="22"/>
+        </w:rPr>
+        <w:t xml:space="preserve"> hanya bila perubahannya &lt; 5 %. Di sudut tajam tanpa fillet σ terus naik saat mesh dihaluskan (singularitas), jadi angkanya tidak boleh dipakai.</w:t>
       </w:r>
     </w:p>
     <w:p>
@@ -14770,7 +14789,7 @@
           <w:i w:val="0"/>
           <w:sz w:val="22"/>
         </w:rPr>
-        <w:t>Lengkapi tabel iterasi (r, hr, d, material, σ, δ, massa, SF); pilih desain dengan SF ≥ 2, δ ≤ 0,25 mm, massa terkecil; bila belum ada kombinasi yang memenuhi keduanya, catat kombinasi terbaik dan usulkan perbaikan (mis. fillet pertemuan rusuk, tebal lebih besar). Ctrl+S → Latihan10_NIM.FCStd.</w:t>
+        <w:t>Lengkapi tabel iterasi (r, hr, d, material, σ, δ, massa, SF); pilih desain dengan SF ≥ 2, δ ≤ 0,20 mm, massa terkecil; bila belum ada kombinasi yang memenuhi keduanya, catat kombinasi terbaik dan usulkan perbaikan (mis. fillet pertemuan rusuk, tebal lebih besar). Ctrl+S → Latihan10_NIM.FCStd.</w:t>
       </w:r>
     </w:p>
     <w:p>

</xml_diff>

<commit_message>
fix(cad): Modul 10 - gaya 900 N, batas delta 0,20 mm, fillet rusuk 5 mm dan uji konvergensi mesh (#1028)
Co-authored-by: Claude Sonnet 5.5 <noreply@anthropic.com>
</commit_message>
<xml_diff>
--- a/Pemodelan-Computer-Aided-Design/Modul-Word/Modul-10-Optimasi-Desain-Pasca-Simulasi.docx
+++ b/Pemodelan-Computer-Aided-Design/Modul-Word/Modul-10-Optimasi-Desain-Pasca-Simulasi.docx
@@ -14368,7 +14368,7 @@
           <w:i w:val="0"/>
           <w:sz w:val="20"/>
         </w:rPr>
-        <w:t>Gambar 7 — Gambar kerja braket L iteratif: ukuran awal dan parameter yang diubah tiap langkah. Satuan mm; gaya dalam N dan tegangan dalam MPa. Kiri: profil L yang disketsa pada langkah 1 (braket 100 × 80, tebal t = 8) dengan fillet sudut dalam r = 2 yang dinaikkan menjadi 6 lalu 10 pada langkah 3 (busur merah muda), Fixed di muka kaki berlubang, dan F = 1000 N di tepi kaki tegak (langkah 2). Tengah: sketsa rusuk langkah 4 pada bidang tengah, kaki 40 × hr dengan hr = 20 lalu 30, Pad 5 simetris. Kanan: hasil Pad selebar 50 dengan lubang baut 2 × ⌀9 dan lubang ⌀d langkah 5 (15 → 20 → 25); langkah tidak menetapkan letak kedua jenis lubang itu, jadi posisinya tidak diberi ukuran. Nomor bulat di bawah merujuk nomor langkah.</w:t>
+        <w:t>Gambar 7 — Gambar kerja braket L iteratif: ukuran awal dan parameter yang diubah tiap langkah. Satuan mm; gaya dalam N dan tegangan dalam MPa. Kiri: profil L yang disketsa pada langkah 1 (braket 100 × 80, tebal t = 8) dengan fillet sudut dalam r = 2 yang dinaikkan menjadi 6 lalu 10 pada langkah 3 (busur merah muda), Fixed di muka kaki berlubang, dan F = 900 N di tepi kaki tegak (langkah 2). Tengah: sketsa rusuk langkah 4 pada bidang tengah, kaki 40 × hr dengan hr = 20 lalu 30, Pad 5 simetris. Kanan: hasil Pad selebar 50 dengan lubang baut 2 × ⌀9 dan lubang ⌀d langkah 5 (15 → 20 → 25); langkah tidak menetapkan letak kedua jenis lubang itu, jadi posisinya tidak diberi ukuran. Nomor bulat di bawah merujuk nomor langkah.</w:t>
       </w:r>
     </w:p>
     <w:p>
@@ -14401,7 +14401,7 @@
           <w:i w:val="0"/>
           <w:sz w:val="22"/>
         </w:rPr>
-        <w:t>Spreadsheet: alias tebal = 8, r = 2, hr = 0, d = 0, gaya = 1000 (jangan memakai t atau F: FreeCAD menolaknya sebagai alias karena sama dengan satuan ton dan farad). Body: braket L 100 × 80 (lebar 50) dengan Sketch tebal =Spreadsheet.tebal, lubang baut 2 × ⌀9 di kaki, fillet sudut dalam radius =Spreadsheet.r. Recompute, catat massa baja (Volume × 7,85×10⁻³).</w:t>
+        <w:t>Spreadsheet: alias tebal = 8, r = 2, hr = 0, d = 0, gaya = 900 (jangan memakai t atau F: FreeCAD menolaknya sebagai alias karena sama dengan satuan ton dan farad). Body: braket L 100 × 80 (lebar 50) dengan Sketch tebal =Spreadsheet.tebal, lubang baut 2 × ⌀9 di kaki, fillet sudut dalam radius =Spreadsheet.r. Recompute, catat massa baja (Volume × 7,85×10⁻³).</w:t>
       </w:r>
     </w:p>
     <w:p>
@@ -14562,7 +14562,7 @@
           <w:i w:val="0"/>
           <w:sz w:val="22"/>
         </w:rPr>
-        <w:t xml:space="preserve"> ≥ 2 (pada gaya = 1000 N dan tebal = 8 mm, r = 10 memberi σ</w:t>
+        <w:t xml:space="preserve"> ≥ 2 (pada gaya = 900 N dan tebal = 8 mm, r = 10 memberi σ</w:t>
       </w:r>
       <w:r>
         <w:rPr>
@@ -14581,7 +14581,7 @@
           <w:i w:val="0"/>
           <w:sz w:val="22"/>
         </w:rPr>
-        <w:t xml:space="preserve"> ≈ 125 MPa; bila SF masih &lt; 2, perbesar r atau tebal).</w:t>
+        <w:t xml:space="preserve"> ≈ 113 MPa dan SF ≈ 2,2, sedangkan r = 6 baru SF ≈ 1,9; bila SF masih &lt; 2, perbesar r atau tebal).</w:t>
       </w:r>
     </w:p>
     <w:p>
@@ -14633,7 +14633,26 @@
           <w:i w:val="0"/>
           <w:sz w:val="22"/>
         </w:rPr>
-        <w:t xml:space="preserve"> &gt; 0,25 mm: sketsa segitiga rusuk pada bidang tengah (kaki 40 × hr), Pad 5 mm simetris; ubah hr = 20 → 30. Catat δ turun (Bagian 03) dan σ baru di pertemuan rusuk–pelat; beri fillet 2 mm di sana.</w:t>
+        <w:t xml:space="preserve"> &gt; 0,20 mm: sketsa segitiga rusuk pada bidang tengah (kaki 40 × hr), Pad 5 mm simetris; ubah hr = 20 → 30. Catat δ turun (Bagian 03). Di pertemuan rusuk–pelat tegangan naik lagi; beri fillet 5 mm di sana, lalu haluskan mesh dua kali (mis. 4 → 3 → 2,4 mm) dan catat σ</w:t>
+      </w:r>
+      <w:r>
+        <w:rPr>
+          <w:rFonts w:ascii="Arial" w:hAnsi="Arial" w:eastAsia="Arial" w:cs="Arial"/>
+          <w:b w:val="0"/>
+          <w:i w:val="0"/>
+          <w:sz w:val="22"/>
+          <w:vertAlign w:val="subscript"/>
+        </w:rPr>
+        <w:t>maks</w:t>
+      </w:r>
+      <w:r>
+        <w:rPr>
+          <w:rFonts w:ascii="Arial" w:hAnsi="Arial" w:eastAsia="Arial" w:cs="Arial"/>
+          <w:b w:val="0"/>
+          <w:i w:val="0"/>
+          <w:sz w:val="22"/>
+        </w:rPr>
+        <w:t xml:space="preserve"> hanya bila perubahannya &lt; 5 %. Di sudut tajam tanpa fillet σ terus naik saat mesh dihaluskan (singularitas), jadi angkanya tidak boleh dipakai.</w:t>
       </w:r>
     </w:p>
     <w:p>
@@ -14770,7 +14789,7 @@
           <w:i w:val="0"/>
           <w:sz w:val="22"/>
         </w:rPr>
-        <w:t>Lengkapi tabel iterasi (r, hr, d, material, σ, δ, massa, SF); pilih desain dengan SF ≥ 2, δ ≤ 0,25 mm, massa terkecil; bila belum ada kombinasi yang memenuhi keduanya, catat kombinasi terbaik dan usulkan perbaikan (mis. fillet pertemuan rusuk, tebal lebih besar). Ctrl+S → Latihan10_NIM.FCStd.</w:t>
+        <w:t>Lengkapi tabel iterasi (r, hr, d, material, σ, δ, massa, SF); pilih desain dengan SF ≥ 2, δ ≤ 0,20 mm, massa terkecil; bila belum ada kombinasi yang memenuhi keduanya, catat kombinasi terbaik dan usulkan perbaikan (mis. fillet pertemuan rusuk, tebal lebih besar). Ctrl+S → Latihan10_NIM.FCStd.</w:t>
       </w:r>
     </w:p>
     <w:p>

</xml_diff>

<commit_message>
feat(cad): video Modul 10 versi klik GUI + zoom konsol utuh di video Modul 1-10
Modul 10 (35:35), braket L parametrik dari Spreadsheet:
- alias tebal, r, hr, d, gaya (900 N) mengendalikan dimensi sketsa, fillet, rusuk, lubang, dan gaya FEM lewat ekspresi
- iterasi r 2 -> 6 -> 10 (188,0 -> 113,0 MPa), rusuk hr 20/30, lubang d 15/20/25, aluminium tebal =8*3^(1/3)
- Gmsh High Order Optimize mencegah elemen orde 2 cacat; tabel iterasi di Spreadsheet
- teks langkah 1-7 memakai angka hasil sebenarnya; klaim konvergensi fillet rusuk diganti hasil nyata
  (144,6 -> 153,7 -> 163,3 MPa, belum konvergen) beserta saran perbaikan geometri

Video Modul 1-10: caption ber-zoom yang memotong baris konsol/panel properti (12 caption)
memakai zoom yang pas sehingga perintah dan nilainya terbaca utuh; dirender ulang.

Co-Authored-By: Claude Opus 5.5 <noreply@anthropic.com>
</commit_message>
<xml_diff>
--- a/Pemodelan-Computer-Aided-Design/Modul-Word/Modul-10-Optimasi-Desain-Pasca-Simulasi.docx
+++ b/Pemodelan-Computer-Aided-Design/Modul-Word/Modul-10-Optimasi-Desain-Pasca-Simulasi.docx
@@ -14368,7 +14368,7 @@
           <w:i w:val="0"/>
           <w:sz w:val="20"/>
         </w:rPr>
-        <w:t>Gambar 7 — Gambar kerja braket L iteratif: ukuran awal dan parameter yang diubah tiap langkah. Satuan mm; gaya dalam N dan tegangan dalam MPa. Kiri: profil L yang disketsa pada langkah 1 (braket 100 × 80, tebal t = 8) dengan fillet sudut dalam r = 2 yang dinaikkan menjadi 6 lalu 10 pada langkah 3 (busur merah muda), Fixed di muka kaki berlubang, dan F = 900 N di tepi kaki tegak (langkah 2). Tengah: sketsa rusuk langkah 4 pada bidang tengah, kaki 40 × hr dengan hr = 20 lalu 30, Pad 5 simetris. Kanan: hasil Pad selebar 50 dengan lubang baut 2 × ⌀9 dan lubang ⌀d langkah 5 (15 → 20 → 25); langkah tidak menetapkan letak kedua jenis lubang itu, jadi posisinya tidak diberi ukuran. Nomor bulat di bawah merujuk nomor langkah.</w:t>
+        <w:t>Gambar 7 — Gambar kerja braket L iteratif: ukuran awal dan parameter yang diubah tiap langkah. Satuan mm; gaya dalam N dan tegangan dalam MPa. Kiri: profil L yang disketsa pada langkah 1 (braket 100 × 80, tebal t = 8) dengan fillet sudut dalam r = 2 yang dinaikkan menjadi 6 lalu 10 pada langkah 3 (busur merah muda), Fixed di muka kaki berlubang, dan F = 900 N di tepi kaki tegak (langkah 2). Tengah: sketsa rusuk langkah 4 pada bidang tengah, kaki 40 × hr dengan hr = 20 lalu 30, Pad 5 simetris. Kanan: hasil Pad selebar 50 dengan lubang baut 2 × ⌀9 dan lubang ⌀d langkah 5 (15 → 20 → 25); letak kedua jenis lubang ditulis di teks langkah (baut di x 70, y 12,5 dan 37,5; ⌀d di y 25, z 50). Nomor bulat di bawah merujuk nomor langkah.</w:t>
       </w:r>
     </w:p>
     <w:p>
@@ -14401,7 +14401,25 @@
           <w:i w:val="0"/>
           <w:sz w:val="22"/>
         </w:rPr>
-        <w:t>Spreadsheet: alias tebal = 8, r = 2, hr = 0, d = 0, gaya = 900 (jangan memakai t atau F: FreeCAD menolaknya sebagai alias karena sama dengan satuan ton dan farad). Body: braket L 100 × 80 (lebar 50) dengan Sketch tebal =Spreadsheet.tebal, lubang baut 2 × ⌀9 di kaki, fillet sudut dalam radius =Spreadsheet.r. Recompute, catat massa baja (Volume × 7,85×10⁻³).</w:t>
+        <w:t xml:space="preserve">Workbench Spreadsheet → New Spreadsheet, klik ganda: kolom A tebal, r, hr, d, gaya; kolom B 8, 2, 0, 0, 900 N, lalu tiap sel B diberi nama lewat kotak </w:t>
+      </w:r>
+      <w:r>
+        <w:rPr>
+          <w:rFonts w:ascii="Arial" w:hAnsi="Arial" w:eastAsia="Arial" w:cs="Arial"/>
+          <w:b w:val="0"/>
+          <w:i/>
+          <w:sz w:val="22"/>
+        </w:rPr>
+        <w:t>Alias</w:t>
+      </w:r>
+      <w:r>
+        <w:rPr>
+          <w:rFonts w:ascii="Arial" w:hAnsi="Arial" w:eastAsia="Arial" w:cs="Arial"/>
+          <w:b w:val="0"/>
+          <w:i w:val="0"/>
+          <w:sz w:val="22"/>
+        </w:rPr>
+        <w:t>: tebal, r, hr, d, gaya (jangan memakai t atau F: FreeCAD menolaknya sebagai alias karena sama dengan satuan ton dan farad; gaya diketik bersatuan agar terbaca newton). Part Design → New Body → Sketch XZ: Polyline profil L, Horizontal Dimension 100, Vertical Dimension 80, lalu dua tebal kaki: di dialog dimensi ketik = dan Spreadsheet.tebal. Pad 50 Reversed; Fillet sudut dalam dengan Radius =Spreadsheet.r; lubang baut 2 × ⌀9 di (70; 12,5) dan (70; 37,5) dari sketsa XY + Toggle Section View → Pocket Through all Reversed. Massa baja = Volume × 7,85×10⁻³ = 532,4 g.</w:t>
       </w:r>
     </w:p>
     <w:p>
@@ -14434,7 +14452,7 @@
           <w:i w:val="0"/>
           <w:sz w:val="22"/>
         </w:rPr>
-        <w:t>FEM Workbench (Modul 8): Analysis, material Steel, mesh Gmsh 3 mm, Fixed di muka kaki berlubang, Force =Spreadsheet.gaya pada tepi kaki tegak, solve CalculiX. Catat σ</w:t>
+        <w:t>Workbench FEM: New Analysis; Solid Material Steel-Generic dengan Young's modulus 210 GPa dan Density 7850 kg/m³ (Use this task panel, seperti Modul 8). Fixed Boundary Condition: tekan 5 (Bottom), Add, klik alas kaki berlubang. Force Load: tekan 6 (Left), klik muka luar kaki tegak → Direction; tekan 2 (Top), Add, klik muka atas kaki tegak; Force =Spreadsheet.gaya. Mesh From Shape by Gmsh: 2nd, Maximum size 4 mm, dan Data → High Order Optimize = Optimization (mencegah elemen orde 2 cacat, pesan CalculiX “nonpositive jacobian”). Solver CalculiX Static. Python console, sekali: baca = lambda rho=7.85e-3: (round(max(App.ActiveDocument.CCX_Results.vonMises), 1), round(max(App.ActiveDocument.CCX_Results.DisplacementLengths), 3), round(App.ActiveDocument.Body.Shape.Volume * rho, 1)), lalu baca() → σ</w:t>
       </w:r>
       <w:r>
         <w:rPr>
@@ -14453,7 +14471,7 @@
           <w:i w:val="0"/>
           <w:sz w:val="22"/>
         </w:rPr>
-        <w:t xml:space="preserve"> (di sudut dalam), δ</w:t>
+        <w:t xml:space="preserve"> 188,0 MPa (sudut dalam), δ</w:t>
       </w:r>
       <w:r>
         <w:rPr>
@@ -14472,7 +14490,7 @@
           <w:i w:val="0"/>
           <w:sz w:val="22"/>
         </w:rPr>
-        <w:t>, massa pada baris iterasi 0 Spreadsheet.</w:t>
+        <w:t xml:space="preserve"> 0,277 mm, massa 532,4 g; SF = 250/188,0 = 1,33.</w:t>
       </w:r>
     </w:p>
     <w:p>
@@ -14505,7 +14523,7 @@
           <w:i w:val="0"/>
           <w:sz w:val="22"/>
         </w:rPr>
-        <w:t>Ubah r: 2 → 6 → 10; recompute dan solve ulang tiap kali. Catat σ</w:t>
+        <w:t>Ubah r di Spreadsheet: 2 → 6 → 10; Recompute, klik ganda FEMMeshGmsh → Apply, jalankan solver lagi, baca(). r = 6: σ</w:t>
       </w:r>
       <w:r>
         <w:rPr>
@@ -14524,7 +14542,7 @@
           <w:i w:val="0"/>
           <w:sz w:val="22"/>
         </w:rPr>
-        <w:t>: turun mengikuti K</w:t>
+        <w:t xml:space="preserve"> 129,1 MPa (SF 1,94); r = 10: 113,0 MPa (SF 2,21); massa hanya naik 535,1 → 540,5 g. σ turun mengikuti K</w:t>
       </w:r>
       <w:r>
         <w:rPr>
@@ -14543,7 +14561,7 @@
           <w:i w:val="0"/>
           <w:sz w:val="22"/>
         </w:rPr>
-        <w:t xml:space="preserve"> (Bagian 02) tanpa perubahan massa berarti. Pilih r yang memberi SF = 250/σ</w:t>
+        <w:t xml:space="preserve"> (Bagian 02), dan r = 10 memenuhi SF ≥ 2; δ</w:t>
       </w:r>
       <w:r>
         <w:rPr>
@@ -14562,26 +14580,7 @@
           <w:i w:val="0"/>
           <w:sz w:val="22"/>
         </w:rPr>
-        <w:t xml:space="preserve"> ≥ 2 (pada gaya = 900 N dan tebal = 8 mm, r = 10 memberi σ</w:t>
-      </w:r>
-      <w:r>
-        <w:rPr>
-          <w:rFonts w:ascii="Arial" w:hAnsi="Arial" w:eastAsia="Arial" w:cs="Arial"/>
-          <w:b w:val="0"/>
-          <w:i w:val="0"/>
-          <w:sz w:val="22"/>
-          <w:vertAlign w:val="subscript"/>
-        </w:rPr>
-        <w:t>maks</w:t>
-      </w:r>
-      <w:r>
-        <w:rPr>
-          <w:rFonts w:ascii="Arial" w:hAnsi="Arial" w:eastAsia="Arial" w:cs="Arial"/>
-          <w:b w:val="0"/>
-          <w:i w:val="0"/>
-          <w:sz w:val="22"/>
-        </w:rPr>
-        <w:t xml:space="preserve"> ≈ 113 MPa dan SF ≈ 2,2, sedangkan r = 6 baru SF ≈ 1,9; bila SF masih &lt; 2, perbesar r atau tebal).</w:t>
+        <w:t xml:space="preserve"> 0,230 mm masih di atas 0,20 mm.</w:t>
       </w:r>
     </w:p>
     <w:p>
@@ -14614,7 +14613,7 @@
           <w:i w:val="0"/>
           <w:sz w:val="22"/>
         </w:rPr>
-        <w:t>Bila δ</w:t>
+        <w:t>hr = 20 di Spreadsheet. Sketch XZ, Data → Attachment Offset z = −25 (bidang tengah), Toggle Section View; segitiga Polyline dengan sudut terkunci di (=Spreadsheet.tebal, =Spreadsheet.tebal), kaki 40, tinggi =Spreadsheet.hr; Pad 5 mm Symmetric. hr = 20: δ 0,173 mm; hr = 30: δ 0,120 mm, tetapi σ 181,3 MPa di sudut tajam pertemuan rusuk–pelat naik menjadi 215,2 MPa pada mesh 2,5 mm (singularitas; mesh 3 dan 2,4 mm tanpa fillet bahkan menghasilkan elemen cacat). Beri Fillet 5 mm pada keenam tepi pertemuan rusuk di kedua sisinya: δ 0,115 mm, massa 568,4 g. Mesh 4 → 3 → 2,4 mm memberi σ</w:t>
       </w:r>
       <w:r>
         <w:rPr>
@@ -14633,26 +14632,25 @@
           <w:i w:val="0"/>
           <w:sz w:val="22"/>
         </w:rPr>
-        <w:t xml:space="preserve"> &gt; 0,20 mm: sketsa segitiga rusuk pada bidang tengah (kaki 40 × hr), Pad 5 mm simetris; ubah hr = 20 → 30. Catat δ turun (Bagian 03). Di pertemuan rusuk–pelat tegangan naik lagi; beri fillet 5 mm di sana, lalu haluskan mesh dua kali (mis. 4 → 3 → 2,4 mm) dan catat σ</w:t>
-      </w:r>
-      <w:r>
-        <w:rPr>
-          <w:rFonts w:ascii="Arial" w:hAnsi="Arial" w:eastAsia="Arial" w:cs="Arial"/>
-          <w:b w:val="0"/>
-          <w:i w:val="0"/>
-          <w:sz w:val="22"/>
-          <w:vertAlign w:val="subscript"/>
-        </w:rPr>
-        <w:t>maks</w:t>
-      </w:r>
-      <w:r>
-        <w:rPr>
-          <w:rFonts w:ascii="Arial" w:hAnsi="Arial" w:eastAsia="Arial" w:cs="Arial"/>
-          <w:b w:val="0"/>
-          <w:i w:val="0"/>
-          <w:sz w:val="22"/>
-        </w:rPr>
-        <w:t xml:space="preserve"> hanya bila perubahannya &lt; 5 %. Di sudut tajam tanpa fillet σ terus naik saat mesh dihaluskan (singularitas), jadi angkanya tidak boleh dipakai.</w:t>
+        <w:t xml:space="preserve"> 144,6 → 153,7 → 163,3 MPa: masih naik sekitar 6 % tiap penghalusan, jadi </w:t>
+      </w:r>
+      <w:r>
+        <w:rPr>
+          <w:rFonts w:ascii="Arial" w:hAnsi="Arial" w:eastAsia="Arial" w:cs="Arial"/>
+          <w:b/>
+          <w:i w:val="0"/>
+          <w:sz w:val="22"/>
+        </w:rPr>
+        <w:t>belum konvergen</w:t>
+      </w:r>
+      <w:r>
+        <w:rPr>
+          <w:rFonts w:ascii="Arial" w:hAnsi="Arial" w:eastAsia="Arial" w:cs="Arial"/>
+          <w:b w:val="0"/>
+          <w:i w:val="0"/>
+          <w:sz w:val="22"/>
+        </w:rPr>
+        <w:t>. Kurva tempat rusuk memotong fillet sudut dalam tetap menjadi pemusat tegangan; anggap angka itu batas bawah dan perbaiki geometrinya (fillet lebih besar, rusuk tidak menyentuh fillet sudut dalam) sebelum dipakai sebagai dasar SF.</w:t>
       </w:r>
     </w:p>
     <w:p>
@@ -14685,26 +14683,7 @@
           <w:i w:val="0"/>
           <w:sz w:val="22"/>
         </w:rPr>
-        <w:t>Tambah lubang ⌀d di daerah biru kontur (dekat sumbu netral kaki tegak): d = 15 → 20 → 25. Berhenti saat σ</w:t>
-      </w:r>
-      <w:r>
-        <w:rPr>
-          <w:rFonts w:ascii="Arial" w:hAnsi="Arial" w:eastAsia="Arial" w:cs="Arial"/>
-          <w:b w:val="0"/>
-          <w:i w:val="0"/>
-          <w:sz w:val="22"/>
-          <w:vertAlign w:val="subscript"/>
-        </w:rPr>
-        <w:t>maks</w:t>
-      </w:r>
-      <w:r>
-        <w:rPr>
-          <w:rFonts w:ascii="Arial" w:hAnsi="Arial" w:eastAsia="Arial" w:cs="Arial"/>
-          <w:b w:val="0"/>
-          <w:i w:val="0"/>
-          <w:sz w:val="22"/>
-        </w:rPr>
-        <w:t xml:space="preserve"> mendekati 125 MPa atau massa sudah ≤ target (Bagian 04).</w:t>
+        <w:t>Lubang ⌀d tembus arah X di kaki tegak: sketsa YZ + Toggle Section View, pusat (y 25, z 50), Diameter =Spreadsheet.d, Pocket Through all Symmetric. d = 15: σ 133,8 MPa, δ 0,134 mm, 557,3 g; d = 20: 164,2 MPa, 0,154 mm, 548,7 g; d = 25: 176,5 MPa, 0,184 mm, 537,6 g. Massa turun, tetapi σ naik dan SF jatuh dari 1,87 ke 1,42 (Bagian 04): baja dengan lubang tidak memenuhi SF ≥ 2.</w:t>
       </w:r>
     </w:p>
     <w:p>
@@ -14737,26 +14716,7 @@
           <w:i w:val="0"/>
           <w:sz w:val="22"/>
         </w:rPr>
-        <w:t>Duplikat dokumen; material Aluminium, tebal =Spreadsheet.tebal * pow(3; 1/3). Solve: δ hampir sama, massa ≈ setengah, periksa σ</w:t>
-      </w:r>
-      <w:r>
-        <w:rPr>
-          <w:rFonts w:ascii="Arial" w:hAnsi="Arial" w:eastAsia="Arial" w:cs="Arial"/>
-          <w:b w:val="0"/>
-          <w:i w:val="0"/>
-          <w:sz w:val="22"/>
-          <w:vertAlign w:val="subscript"/>
-        </w:rPr>
-        <w:t>maks</w:t>
-      </w:r>
-      <w:r>
-        <w:rPr>
-          <w:rFonts w:ascii="Arial" w:hAnsi="Arial" w:eastAsia="Arial" w:cs="Arial"/>
-          <w:b w:val="0"/>
-          <w:i w:val="0"/>
-          <w:sz w:val="22"/>
-        </w:rPr>
-        <w:t xml:space="preserve"> ≤ 240/2 = 120 MPa (Bagian 05).</w:t>
+        <w:t>Klik ganda MaterialSolid → Aluminum-Generic (E 70 GPa, ν 0,35, ρ 2700 kg/m³); sel tebal diganti =8 * 3 ^ (1 / 3) = 11,54 mm agar E·t³ setara. Konsol baca(2.7e-3). d = 25: σ 87,7 MPa, δ 0,209 mm (&gt; 0,20 mm), 255,4 g; d = 20: σ 88,5 MPa ≤ 240/2 = 120 MPa, δ 0,173 mm, massa 261,1 g (≈ separuh baja). Angka σ ini dibaca pada mesh 4 mm; catatan konvergensi langkah 4 tetap berlaku (Bagian 05).</w:t>
       </w:r>
     </w:p>
     <w:p>
@@ -14789,7 +14749,7 @@
           <w:i w:val="0"/>
           <w:sz w:val="22"/>
         </w:rPr>
-        <w:t>Lengkapi tabel iterasi (r, hr, d, material, σ, δ, massa, SF); pilih desain dengan SF ≥ 2, δ ≤ 0,20 mm, massa terkecil; bila belum ada kombinasi yang memenuhi keduanya, catat kombinasi terbaik dan usulkan perbaikan (mis. fillet pertemuan rusuk, tebal lebih besar). Ctrl+S → Latihan10_NIM.FCStd.</w:t>
+        <w:t>Tabel di Spreadsheet mulai baris 8: iterasi, sigma, delta, massa, SF (rumus =250 / B… untuk baja, =240 / B… untuk aluminium). Terpilih: aluminium, tebal 11,54, r 10, hr 30 + fillet 5, d 20: σ 88,5 MPa (SF 2,71), δ 0,173 mm ≤ 0,20 mm, massa 261,1 g. Desain baja belum memenuhi SF ≥ 2 dan δ ≤ 0,20 mm sekaligus; usulkan fillet pertemuan rusuk lebih besar atau tebal lebih besar. Ctrl+S → Latihan10_NIM.FCStd.</w:t>
       </w:r>
     </w:p>
     <w:p>
@@ -15349,7 +15309,7 @@
                 <w:i w:val="0"/>
                 <w:sz w:val="18"/>
               </w:rPr>
-              <w:t>Sudut tajam (singularitas), bukan fillet</w:t>
+              <w:t>Sudut tajam (singularitas), atau kurva tempat dua fillet bertemu (rusuk–fillet sudut dalam)</w:t>
             </w:r>
           </w:p>
         </w:tc>
@@ -15368,7 +15328,7 @@
                 <w:i w:val="0"/>
                 <w:sz w:val="18"/>
               </w:rPr>
-              <w:t>Beri fillet dahulu; nilai σ hanya dibaca di fillet</w:t>
+              <w:t>Beri fillet dahulu dan jauhkan rusuk dari fillet sudut dalam; pakai σ hanya bila perubahan antar-mesh &lt; 5 %</w:t>
             </w:r>
           </w:p>
         </w:tc>

</xml_diff>

<commit_message>
feat(cad): video Modul 10 versi klik GUI + zoom konsol utuh di video Modul 1-10 (#1046)
Modul 10 (35:35), braket L parametrik dari Spreadsheet:
- alias tebal, r, hr, d, gaya (900 N) mengendalikan dimensi sketsa, fillet, rusuk, lubang, dan gaya FEM lewat ekspresi
- iterasi r 2 -> 6 -> 10 (188,0 -> 113,0 MPa), rusuk hr 20/30, lubang d 15/20/25, aluminium tebal =8*3^(1/3)
- Gmsh High Order Optimize mencegah elemen orde 2 cacat; tabel iterasi di Spreadsheet
- teks langkah 1-7 memakai angka hasil sebenarnya; klaim konvergensi fillet rusuk diganti hasil nyata
  (144,6 -> 153,7 -> 163,3 MPa, belum konvergen) beserta saran perbaikan geometri

Video Modul 1-10: caption ber-zoom yang memotong baris konsol/panel properti (12 caption)
memakai zoom yang pas sehingga perintah dan nilainya terbaca utuh; dirender ulang.

Co-authored-by: Claude Opus 5.5 <noreply@anthropic.com>
</commit_message>
<xml_diff>
--- a/Pemodelan-Computer-Aided-Design/Modul-Word/Modul-10-Optimasi-Desain-Pasca-Simulasi.docx
+++ b/Pemodelan-Computer-Aided-Design/Modul-Word/Modul-10-Optimasi-Desain-Pasca-Simulasi.docx
@@ -14368,7 +14368,7 @@
           <w:i w:val="0"/>
           <w:sz w:val="20"/>
         </w:rPr>
-        <w:t>Gambar 7 — Gambar kerja braket L iteratif: ukuran awal dan parameter yang diubah tiap langkah. Satuan mm; gaya dalam N dan tegangan dalam MPa. Kiri: profil L yang disketsa pada langkah 1 (braket 100 × 80, tebal t = 8) dengan fillet sudut dalam r = 2 yang dinaikkan menjadi 6 lalu 10 pada langkah 3 (busur merah muda), Fixed di muka kaki berlubang, dan F = 900 N di tepi kaki tegak (langkah 2). Tengah: sketsa rusuk langkah 4 pada bidang tengah, kaki 40 × hr dengan hr = 20 lalu 30, Pad 5 simetris. Kanan: hasil Pad selebar 50 dengan lubang baut 2 × ⌀9 dan lubang ⌀d langkah 5 (15 → 20 → 25); langkah tidak menetapkan letak kedua jenis lubang itu, jadi posisinya tidak diberi ukuran. Nomor bulat di bawah merujuk nomor langkah.</w:t>
+        <w:t>Gambar 7 — Gambar kerja braket L iteratif: ukuran awal dan parameter yang diubah tiap langkah. Satuan mm; gaya dalam N dan tegangan dalam MPa. Kiri: profil L yang disketsa pada langkah 1 (braket 100 × 80, tebal t = 8) dengan fillet sudut dalam r = 2 yang dinaikkan menjadi 6 lalu 10 pada langkah 3 (busur merah muda), Fixed di muka kaki berlubang, dan F = 900 N di tepi kaki tegak (langkah 2). Tengah: sketsa rusuk langkah 4 pada bidang tengah, kaki 40 × hr dengan hr = 20 lalu 30, Pad 5 simetris. Kanan: hasil Pad selebar 50 dengan lubang baut 2 × ⌀9 dan lubang ⌀d langkah 5 (15 → 20 → 25); letak kedua jenis lubang ditulis di teks langkah (baut di x 70, y 12,5 dan 37,5; ⌀d di y 25, z 50). Nomor bulat di bawah merujuk nomor langkah.</w:t>
       </w:r>
     </w:p>
     <w:p>
@@ -14401,7 +14401,25 @@
           <w:i w:val="0"/>
           <w:sz w:val="22"/>
         </w:rPr>
-        <w:t>Spreadsheet: alias tebal = 8, r = 2, hr = 0, d = 0, gaya = 900 (jangan memakai t atau F: FreeCAD menolaknya sebagai alias karena sama dengan satuan ton dan farad). Body: braket L 100 × 80 (lebar 50) dengan Sketch tebal =Spreadsheet.tebal, lubang baut 2 × ⌀9 di kaki, fillet sudut dalam radius =Spreadsheet.r. Recompute, catat massa baja (Volume × 7,85×10⁻³).</w:t>
+        <w:t xml:space="preserve">Workbench Spreadsheet → New Spreadsheet, klik ganda: kolom A tebal, r, hr, d, gaya; kolom B 8, 2, 0, 0, 900 N, lalu tiap sel B diberi nama lewat kotak </w:t>
+      </w:r>
+      <w:r>
+        <w:rPr>
+          <w:rFonts w:ascii="Arial" w:hAnsi="Arial" w:eastAsia="Arial" w:cs="Arial"/>
+          <w:b w:val="0"/>
+          <w:i/>
+          <w:sz w:val="22"/>
+        </w:rPr>
+        <w:t>Alias</w:t>
+      </w:r>
+      <w:r>
+        <w:rPr>
+          <w:rFonts w:ascii="Arial" w:hAnsi="Arial" w:eastAsia="Arial" w:cs="Arial"/>
+          <w:b w:val="0"/>
+          <w:i w:val="0"/>
+          <w:sz w:val="22"/>
+        </w:rPr>
+        <w:t>: tebal, r, hr, d, gaya (jangan memakai t atau F: FreeCAD menolaknya sebagai alias karena sama dengan satuan ton dan farad; gaya diketik bersatuan agar terbaca newton). Part Design → New Body → Sketch XZ: Polyline profil L, Horizontal Dimension 100, Vertical Dimension 80, lalu dua tebal kaki: di dialog dimensi ketik = dan Spreadsheet.tebal. Pad 50 Reversed; Fillet sudut dalam dengan Radius =Spreadsheet.r; lubang baut 2 × ⌀9 di (70; 12,5) dan (70; 37,5) dari sketsa XY + Toggle Section View → Pocket Through all Reversed. Massa baja = Volume × 7,85×10⁻³ = 532,4 g.</w:t>
       </w:r>
     </w:p>
     <w:p>
@@ -14434,7 +14452,7 @@
           <w:i w:val="0"/>
           <w:sz w:val="22"/>
         </w:rPr>
-        <w:t>FEM Workbench (Modul 8): Analysis, material Steel, mesh Gmsh 3 mm, Fixed di muka kaki berlubang, Force =Spreadsheet.gaya pada tepi kaki tegak, solve CalculiX. Catat σ</w:t>
+        <w:t>Workbench FEM: New Analysis; Solid Material Steel-Generic dengan Young's modulus 210 GPa dan Density 7850 kg/m³ (Use this task panel, seperti Modul 8). Fixed Boundary Condition: tekan 5 (Bottom), Add, klik alas kaki berlubang. Force Load: tekan 6 (Left), klik muka luar kaki tegak → Direction; tekan 2 (Top), Add, klik muka atas kaki tegak; Force =Spreadsheet.gaya. Mesh From Shape by Gmsh: 2nd, Maximum size 4 mm, dan Data → High Order Optimize = Optimization (mencegah elemen orde 2 cacat, pesan CalculiX “nonpositive jacobian”). Solver CalculiX Static. Python console, sekali: baca = lambda rho=7.85e-3: (round(max(App.ActiveDocument.CCX_Results.vonMises), 1), round(max(App.ActiveDocument.CCX_Results.DisplacementLengths), 3), round(App.ActiveDocument.Body.Shape.Volume * rho, 1)), lalu baca() → σ</w:t>
       </w:r>
       <w:r>
         <w:rPr>
@@ -14453,7 +14471,7 @@
           <w:i w:val="0"/>
           <w:sz w:val="22"/>
         </w:rPr>
-        <w:t xml:space="preserve"> (di sudut dalam), δ</w:t>
+        <w:t xml:space="preserve"> 188,0 MPa (sudut dalam), δ</w:t>
       </w:r>
       <w:r>
         <w:rPr>
@@ -14472,7 +14490,7 @@
           <w:i w:val="0"/>
           <w:sz w:val="22"/>
         </w:rPr>
-        <w:t>, massa pada baris iterasi 0 Spreadsheet.</w:t>
+        <w:t xml:space="preserve"> 0,277 mm, massa 532,4 g; SF = 250/188,0 = 1,33.</w:t>
       </w:r>
     </w:p>
     <w:p>
@@ -14505,7 +14523,7 @@
           <w:i w:val="0"/>
           <w:sz w:val="22"/>
         </w:rPr>
-        <w:t>Ubah r: 2 → 6 → 10; recompute dan solve ulang tiap kali. Catat σ</w:t>
+        <w:t>Ubah r di Spreadsheet: 2 → 6 → 10; Recompute, klik ganda FEMMeshGmsh → Apply, jalankan solver lagi, baca(). r = 6: σ</w:t>
       </w:r>
       <w:r>
         <w:rPr>
@@ -14524,7 +14542,7 @@
           <w:i w:val="0"/>
           <w:sz w:val="22"/>
         </w:rPr>
-        <w:t>: turun mengikuti K</w:t>
+        <w:t xml:space="preserve"> 129,1 MPa (SF 1,94); r = 10: 113,0 MPa (SF 2,21); massa hanya naik 535,1 → 540,5 g. σ turun mengikuti K</w:t>
       </w:r>
       <w:r>
         <w:rPr>
@@ -14543,7 +14561,7 @@
           <w:i w:val="0"/>
           <w:sz w:val="22"/>
         </w:rPr>
-        <w:t xml:space="preserve"> (Bagian 02) tanpa perubahan massa berarti. Pilih r yang memberi SF = 250/σ</w:t>
+        <w:t xml:space="preserve"> (Bagian 02), dan r = 10 memenuhi SF ≥ 2; δ</w:t>
       </w:r>
       <w:r>
         <w:rPr>
@@ -14562,26 +14580,7 @@
           <w:i w:val="0"/>
           <w:sz w:val="22"/>
         </w:rPr>
-        <w:t xml:space="preserve"> ≥ 2 (pada gaya = 900 N dan tebal = 8 mm, r = 10 memberi σ</w:t>
-      </w:r>
-      <w:r>
-        <w:rPr>
-          <w:rFonts w:ascii="Arial" w:hAnsi="Arial" w:eastAsia="Arial" w:cs="Arial"/>
-          <w:b w:val="0"/>
-          <w:i w:val="0"/>
-          <w:sz w:val="22"/>
-          <w:vertAlign w:val="subscript"/>
-        </w:rPr>
-        <w:t>maks</w:t>
-      </w:r>
-      <w:r>
-        <w:rPr>
-          <w:rFonts w:ascii="Arial" w:hAnsi="Arial" w:eastAsia="Arial" w:cs="Arial"/>
-          <w:b w:val="0"/>
-          <w:i w:val="0"/>
-          <w:sz w:val="22"/>
-        </w:rPr>
-        <w:t xml:space="preserve"> ≈ 113 MPa dan SF ≈ 2,2, sedangkan r = 6 baru SF ≈ 1,9; bila SF masih &lt; 2, perbesar r atau tebal).</w:t>
+        <w:t xml:space="preserve"> 0,230 mm masih di atas 0,20 mm.</w:t>
       </w:r>
     </w:p>
     <w:p>
@@ -14614,7 +14613,7 @@
           <w:i w:val="0"/>
           <w:sz w:val="22"/>
         </w:rPr>
-        <w:t>Bila δ</w:t>
+        <w:t>hr = 20 di Spreadsheet. Sketch XZ, Data → Attachment Offset z = −25 (bidang tengah), Toggle Section View; segitiga Polyline dengan sudut terkunci di (=Spreadsheet.tebal, =Spreadsheet.tebal), kaki 40, tinggi =Spreadsheet.hr; Pad 5 mm Symmetric. hr = 20: δ 0,173 mm; hr = 30: δ 0,120 mm, tetapi σ 181,3 MPa di sudut tajam pertemuan rusuk–pelat naik menjadi 215,2 MPa pada mesh 2,5 mm (singularitas; mesh 3 dan 2,4 mm tanpa fillet bahkan menghasilkan elemen cacat). Beri Fillet 5 mm pada keenam tepi pertemuan rusuk di kedua sisinya: δ 0,115 mm, massa 568,4 g. Mesh 4 → 3 → 2,4 mm memberi σ</w:t>
       </w:r>
       <w:r>
         <w:rPr>
@@ -14633,26 +14632,25 @@
           <w:i w:val="0"/>
           <w:sz w:val="22"/>
         </w:rPr>
-        <w:t xml:space="preserve"> &gt; 0,20 mm: sketsa segitiga rusuk pada bidang tengah (kaki 40 × hr), Pad 5 mm simetris; ubah hr = 20 → 30. Catat δ turun (Bagian 03). Di pertemuan rusuk–pelat tegangan naik lagi; beri fillet 5 mm di sana, lalu haluskan mesh dua kali (mis. 4 → 3 → 2,4 mm) dan catat σ</w:t>
-      </w:r>
-      <w:r>
-        <w:rPr>
-          <w:rFonts w:ascii="Arial" w:hAnsi="Arial" w:eastAsia="Arial" w:cs="Arial"/>
-          <w:b w:val="0"/>
-          <w:i w:val="0"/>
-          <w:sz w:val="22"/>
-          <w:vertAlign w:val="subscript"/>
-        </w:rPr>
-        <w:t>maks</w:t>
-      </w:r>
-      <w:r>
-        <w:rPr>
-          <w:rFonts w:ascii="Arial" w:hAnsi="Arial" w:eastAsia="Arial" w:cs="Arial"/>
-          <w:b w:val="0"/>
-          <w:i w:val="0"/>
-          <w:sz w:val="22"/>
-        </w:rPr>
-        <w:t xml:space="preserve"> hanya bila perubahannya &lt; 5 %. Di sudut tajam tanpa fillet σ terus naik saat mesh dihaluskan (singularitas), jadi angkanya tidak boleh dipakai.</w:t>
+        <w:t xml:space="preserve"> 144,6 → 153,7 → 163,3 MPa: masih naik sekitar 6 % tiap penghalusan, jadi </w:t>
+      </w:r>
+      <w:r>
+        <w:rPr>
+          <w:rFonts w:ascii="Arial" w:hAnsi="Arial" w:eastAsia="Arial" w:cs="Arial"/>
+          <w:b/>
+          <w:i w:val="0"/>
+          <w:sz w:val="22"/>
+        </w:rPr>
+        <w:t>belum konvergen</w:t>
+      </w:r>
+      <w:r>
+        <w:rPr>
+          <w:rFonts w:ascii="Arial" w:hAnsi="Arial" w:eastAsia="Arial" w:cs="Arial"/>
+          <w:b w:val="0"/>
+          <w:i w:val="0"/>
+          <w:sz w:val="22"/>
+        </w:rPr>
+        <w:t>. Kurva tempat rusuk memotong fillet sudut dalam tetap menjadi pemusat tegangan; anggap angka itu batas bawah dan perbaiki geometrinya (fillet lebih besar, rusuk tidak menyentuh fillet sudut dalam) sebelum dipakai sebagai dasar SF.</w:t>
       </w:r>
     </w:p>
     <w:p>
@@ -14685,26 +14683,7 @@
           <w:i w:val="0"/>
           <w:sz w:val="22"/>
         </w:rPr>
-        <w:t>Tambah lubang ⌀d di daerah biru kontur (dekat sumbu netral kaki tegak): d = 15 → 20 → 25. Berhenti saat σ</w:t>
-      </w:r>
-      <w:r>
-        <w:rPr>
-          <w:rFonts w:ascii="Arial" w:hAnsi="Arial" w:eastAsia="Arial" w:cs="Arial"/>
-          <w:b w:val="0"/>
-          <w:i w:val="0"/>
-          <w:sz w:val="22"/>
-          <w:vertAlign w:val="subscript"/>
-        </w:rPr>
-        <w:t>maks</w:t>
-      </w:r>
-      <w:r>
-        <w:rPr>
-          <w:rFonts w:ascii="Arial" w:hAnsi="Arial" w:eastAsia="Arial" w:cs="Arial"/>
-          <w:b w:val="0"/>
-          <w:i w:val="0"/>
-          <w:sz w:val="22"/>
-        </w:rPr>
-        <w:t xml:space="preserve"> mendekati 125 MPa atau massa sudah ≤ target (Bagian 04).</w:t>
+        <w:t>Lubang ⌀d tembus arah X di kaki tegak: sketsa YZ + Toggle Section View, pusat (y 25, z 50), Diameter =Spreadsheet.d, Pocket Through all Symmetric. d = 15: σ 133,8 MPa, δ 0,134 mm, 557,3 g; d = 20: 164,2 MPa, 0,154 mm, 548,7 g; d = 25: 176,5 MPa, 0,184 mm, 537,6 g. Massa turun, tetapi σ naik dan SF jatuh dari 1,87 ke 1,42 (Bagian 04): baja dengan lubang tidak memenuhi SF ≥ 2.</w:t>
       </w:r>
     </w:p>
     <w:p>
@@ -14737,26 +14716,7 @@
           <w:i w:val="0"/>
           <w:sz w:val="22"/>
         </w:rPr>
-        <w:t>Duplikat dokumen; material Aluminium, tebal =Spreadsheet.tebal * pow(3; 1/3). Solve: δ hampir sama, massa ≈ setengah, periksa σ</w:t>
-      </w:r>
-      <w:r>
-        <w:rPr>
-          <w:rFonts w:ascii="Arial" w:hAnsi="Arial" w:eastAsia="Arial" w:cs="Arial"/>
-          <w:b w:val="0"/>
-          <w:i w:val="0"/>
-          <w:sz w:val="22"/>
-          <w:vertAlign w:val="subscript"/>
-        </w:rPr>
-        <w:t>maks</w:t>
-      </w:r>
-      <w:r>
-        <w:rPr>
-          <w:rFonts w:ascii="Arial" w:hAnsi="Arial" w:eastAsia="Arial" w:cs="Arial"/>
-          <w:b w:val="0"/>
-          <w:i w:val="0"/>
-          <w:sz w:val="22"/>
-        </w:rPr>
-        <w:t xml:space="preserve"> ≤ 240/2 = 120 MPa (Bagian 05).</w:t>
+        <w:t>Klik ganda MaterialSolid → Aluminum-Generic (E 70 GPa, ν 0,35, ρ 2700 kg/m³); sel tebal diganti =8 * 3 ^ (1 / 3) = 11,54 mm agar E·t³ setara. Konsol baca(2.7e-3). d = 25: σ 87,7 MPa, δ 0,209 mm (&gt; 0,20 mm), 255,4 g; d = 20: σ 88,5 MPa ≤ 240/2 = 120 MPa, δ 0,173 mm, massa 261,1 g (≈ separuh baja). Angka σ ini dibaca pada mesh 4 mm; catatan konvergensi langkah 4 tetap berlaku (Bagian 05).</w:t>
       </w:r>
     </w:p>
     <w:p>
@@ -14789,7 +14749,7 @@
           <w:i w:val="0"/>
           <w:sz w:val="22"/>
         </w:rPr>
-        <w:t>Lengkapi tabel iterasi (r, hr, d, material, σ, δ, massa, SF); pilih desain dengan SF ≥ 2, δ ≤ 0,20 mm, massa terkecil; bila belum ada kombinasi yang memenuhi keduanya, catat kombinasi terbaik dan usulkan perbaikan (mis. fillet pertemuan rusuk, tebal lebih besar). Ctrl+S → Latihan10_NIM.FCStd.</w:t>
+        <w:t>Tabel di Spreadsheet mulai baris 8: iterasi, sigma, delta, massa, SF (rumus =250 / B… untuk baja, =240 / B… untuk aluminium). Terpilih: aluminium, tebal 11,54, r 10, hr 30 + fillet 5, d 20: σ 88,5 MPa (SF 2,71), δ 0,173 mm ≤ 0,20 mm, massa 261,1 g. Desain baja belum memenuhi SF ≥ 2 dan δ ≤ 0,20 mm sekaligus; usulkan fillet pertemuan rusuk lebih besar atau tebal lebih besar. Ctrl+S → Latihan10_NIM.FCStd.</w:t>
       </w:r>
     </w:p>
     <w:p>
@@ -15349,7 +15309,7 @@
                 <w:i w:val="0"/>
                 <w:sz w:val="18"/>
               </w:rPr>
-              <w:t>Sudut tajam (singularitas), bukan fillet</w:t>
+              <w:t>Sudut tajam (singularitas), atau kurva tempat dua fillet bertemu (rusuk–fillet sudut dalam)</w:t>
             </w:r>
           </w:p>
         </w:tc>
@@ -15368,7 +15328,7 @@
                 <w:i w:val="0"/>
                 <w:sz w:val="18"/>
               </w:rPr>
-              <w:t>Beri fillet dahulu; nilai σ hanya dibaca di fillet</w:t>
+              <w:t>Beri fillet dahulu dan jauhkan rusuk dari fillet sudut dalam; pakai σ hanya bila perubahan antar-mesh &lt; 5 %</w:t>
             </w:r>
           </w:p>
         </w:tc>

</xml_diff>